<commit_message>
Upgrade AI internship curriculum to the enhanced 180 unique-topic program.
Replace AI seed tasks from the Downloads package with richer daily procedures and study notes, regenerate Day 002–180 handbooks, and keep Day 001 canonical.

Co-authored-by: Cursor <cursoragent@cursor.com>
</commit_message>
<xml_diff>
--- a/laravel-app/database/data/internship/handbooks/ai/Beyond_AI_Internship_Day_002_Student_Handbook.docx
+++ b/laravel-app/database/data/internship/handbooks/ai/Beyond_AI_Internship_Day_002_Student_Handbook.docx
@@ -38,7 +38,7 @@
           <w:color w:val="1E293B"/>
           <w:sz w:val="28"/>
         </w:rPr>
-        <w:t>Ai Orientation And Responsible Use</w:t>
+        <w:t>AI Roles, Workflows, and Human Oversight</w:t>
       </w:r>
     </w:p>
     <w:p>
@@ -50,7 +50,7 @@
           <w:b w:val="0"/>
           <w:sz w:val="22"/>
         </w:rPr>
-        <w:t>Guided practical. Full student study guide and practical laboratory manual for Beyond Enterprise interns.</w:t>
+        <w:t>Concept development. Full student study guide and practical laboratory manual for Beyond Enterprise interns.</w:t>
       </w:r>
     </w:p>
     <w:tbl>
@@ -141,7 +141,7 @@
               <w:rPr>
                 <w:sz w:val="18"/>
               </w:rPr>
-              <w:t>Guided practical</w:t>
+              <w:t>Concept development</w:t>
             </w:r>
           </w:p>
         </w:tc>
@@ -167,7 +167,7 @@
               <w:rPr>
                 <w:sz w:val="18"/>
               </w:rPr>
-              <w:t>8 hours</w:t>
+              <w:t>8.0 hours</w:t>
             </w:r>
           </w:p>
         </w:tc>
@@ -198,7 +198,7 @@
           <w:color w:val="0B3F90"/>
           <w:sz w:val="20"/>
         </w:rPr>
-        <w:t>Day 2 objective  Complete the guided practical for Ai Orientation And Responsible Use: Apply AI orientation and responsible use safely and explain the result in a professional technical report.</w:t>
+        <w:t>Day 2 objective  Complete the concept development for AI Roles, Workflows, and Human Oversight: Map an AI task from request to accountable human approval.</w:t>
       </w:r>
     </w:p>
     <w:p>
@@ -270,7 +270,7 @@
           <w:b w:val="0"/>
           <w:sz w:val="22"/>
         </w:rPr>
-        <w:t>Submit: Screenshots/photos of the major steps, configuration or worksheet, and a concise result description..</w:t>
+        <w:t>Submit: Setup evidence, completed practical artifact, independent verification record, safety/ethics check, and short technical report..</w:t>
       </w:r>
     </w:p>
     <w:p>
@@ -364,7 +364,7 @@
               <w:rPr>
                 <w:sz w:val="18"/>
               </w:rPr>
-              <w:t>0:00–0:20</w:t>
+              <w:t>0:00–0:30</w:t>
             </w:r>
           </w:p>
         </w:tc>
@@ -377,7 +377,7 @@
               <w:rPr>
                 <w:sz w:val="18"/>
               </w:rPr>
-              <w:t>Authorization + tool verify</w:t>
+              <w:t>Assessment brief + rubric review</w:t>
             </w:r>
           </w:p>
         </w:tc>
@@ -390,7 +390,7 @@
               <w:rPr>
                 <w:sz w:val="18"/>
               </w:rPr>
-              <w:t>Pre-flight</w:t>
+              <w:t>Plan</w:t>
             </w:r>
           </w:p>
         </w:tc>
@@ -405,7 +405,7 @@
               <w:rPr>
                 <w:sz w:val="18"/>
               </w:rPr>
-              <w:t>0:20–1:50</w:t>
+              <w:t>0:30–2:30</w:t>
             </w:r>
           </w:p>
         </w:tc>
@@ -418,7 +418,7 @@
               <w:rPr>
                 <w:sz w:val="18"/>
               </w:rPr>
-              <w:t>Guided practical steps 1–N</w:t>
+              <w:t>End-to-end demonstration</w:t>
             </w:r>
           </w:p>
         </w:tc>
@@ -431,7 +431,7 @@
               <w:rPr>
                 <w:sz w:val="18"/>
               </w:rPr>
-              <w:t>Working artifact</w:t>
+              <w:t>Demo evidence</w:t>
             </w:r>
           </w:p>
         </w:tc>
@@ -446,7 +446,7 @@
               <w:rPr>
                 <w:sz w:val="18"/>
               </w:rPr>
-              <w:t>1:50–2:05</w:t>
+              <w:t>2:30–2:45</w:t>
             </w:r>
           </w:p>
         </w:tc>
@@ -487,7 +487,7 @@
               <w:rPr>
                 <w:sz w:val="18"/>
               </w:rPr>
-              <w:t>2:05–3:50</w:t>
+              <w:t>2:45–4:15</w:t>
             </w:r>
           </w:p>
         </w:tc>
@@ -500,7 +500,7 @@
               <w:rPr>
                 <w:sz w:val="18"/>
               </w:rPr>
-              <w:t>Evaluation / measurement</w:t>
+              <w:t>Self-score against rubric</w:t>
             </w:r>
           </w:p>
         </w:tc>
@@ -513,7 +513,7 @@
               <w:rPr>
                 <w:sz w:val="18"/>
               </w:rPr>
-              <w:t>Metrics or checks</w:t>
+              <w:t>Self-score sheet</w:t>
             </w:r>
           </w:p>
         </w:tc>
@@ -528,7 +528,7 @@
               <w:rPr>
                 <w:sz w:val="18"/>
               </w:rPr>
-              <w:t>3:50–4:05</w:t>
+              <w:t>4:15–5:45</w:t>
             </w:r>
           </w:p>
         </w:tc>
@@ -541,7 +541,7 @@
               <w:rPr>
                 <w:sz w:val="18"/>
               </w:rPr>
-              <w:t>Break</w:t>
+              <w:t>Reflection: wins, failures, next steps</w:t>
             </w:r>
           </w:p>
         </w:tc>
@@ -554,7 +554,7 @@
               <w:rPr>
                 <w:sz w:val="18"/>
               </w:rPr>
-              <w:t>—</w:t>
+              <w:t>Reflection</w:t>
             </w:r>
           </w:p>
         </w:tc>
@@ -569,7 +569,7 @@
               <w:rPr>
                 <w:sz w:val="18"/>
               </w:rPr>
-              <w:t>4:05–5:50</w:t>
+              <w:t>5:45–8:00</w:t>
             </w:r>
           </w:p>
         </w:tc>
@@ -582,7 +582,7 @@
               <w:rPr>
                 <w:sz w:val="18"/>
               </w:rPr>
-              <w:t>Responsible checkpoint + fixes</w:t>
+              <w:t>Final evidence pack + report</w:t>
             </w:r>
           </w:p>
         </w:tc>
@@ -595,89 +595,7 @@
               <w:rPr>
                 <w:sz w:val="18"/>
               </w:rPr>
-              <w:t>Risk table</w:t>
-            </w:r>
-          </w:p>
-        </w:tc>
-      </w:tr>
-      <w:tr>
-        <w:tc>
-          <w:tcPr>
-            <w:tcW w:type="dxa" w:w="3408"/>
-          </w:tcPr>
-          <w:p>
-            <w:r>
-              <w:rPr>
-                <w:sz w:val="18"/>
-              </w:rPr>
-              <w:t>5:50–7:10</w:t>
-            </w:r>
-          </w:p>
-        </w:tc>
-        <w:tc>
-          <w:tcPr>
-            <w:tcW w:type="dxa" w:w="3408"/>
-          </w:tcPr>
-          <w:p>
-            <w:r>
-              <w:rPr>
-                <w:sz w:val="18"/>
-              </w:rPr>
-              <w:t>Evidence + report</w:t>
-            </w:r>
-          </w:p>
-        </w:tc>
-        <w:tc>
-          <w:tcPr>
-            <w:tcW w:type="dxa" w:w="3408"/>
-          </w:tcPr>
-          <w:p>
-            <w:r>
-              <w:rPr>
-                <w:sz w:val="18"/>
-              </w:rPr>
-              <w:t>Pack</w:t>
-            </w:r>
-          </w:p>
-        </w:tc>
-      </w:tr>
-      <w:tr>
-        <w:tc>
-          <w:tcPr>
-            <w:tcW w:type="dxa" w:w="3408"/>
-          </w:tcPr>
-          <w:p>
-            <w:r>
-              <w:rPr>
-                <w:sz w:val="18"/>
-              </w:rPr>
-              <w:t>7:10–8:00</w:t>
-            </w:r>
-          </w:p>
-        </w:tc>
-        <w:tc>
-          <w:tcPr>
-            <w:tcW w:type="dxa" w:w="3408"/>
-          </w:tcPr>
-          <w:p>
-            <w:r>
-              <w:rPr>
-                <w:sz w:val="18"/>
-              </w:rPr>
-              <w:t>Self-check + supervisor rehearsal</w:t>
-            </w:r>
-          </w:p>
-        </w:tc>
-        <w:tc>
-          <w:tcPr>
-            <w:tcW w:type="dxa" w:w="3408"/>
-          </w:tcPr>
-          <w:p>
-            <w:r>
-              <w:rPr>
-                <w:sz w:val="18"/>
-              </w:rPr>
-              <w:t>Ready pack</w:t>
+              <w:t>Submission</w:t>
             </w:r>
           </w:p>
         </w:tc>
@@ -701,7 +619,7 @@
           <w:b w:val="0"/>
           <w:sz w:val="20"/>
         </w:rPr>
-        <w:t>Curriculum objective (source of truth): Apply AI orientation and responsible use safely and explain the result in a professional technical report.</w:t>
+        <w:t>Curriculum objective (source of truth): Map an AI task from request to accountable human approval.</w:t>
       </w:r>
     </w:p>
     <w:p>
@@ -713,7 +631,7 @@
           <w:b w:val="0"/>
           <w:sz w:val="22"/>
         </w:rPr>
-        <w:t>Explain Ai Orientation And Responsible Use to a supervisor in under two minutes.</w:t>
+        <w:t>Explain AI Roles, Workflows, and Human Oversight to a supervisor in under two minutes.</w:t>
       </w:r>
     </w:p>
     <w:p>
@@ -725,7 +643,7 @@
           <w:b w:val="0"/>
           <w:sz w:val="22"/>
         </w:rPr>
-        <w:t>Configure or verify the approved tools required for Ai Orientation And Responsible Use.</w:t>
+        <w:t>Configure or verify the approved tools required for AI Roles, Workflows, and Human Oversight.</w:t>
       </w:r>
     </w:p>
     <w:p>
@@ -737,7 +655,7 @@
           <w:b w:val="0"/>
           <w:sz w:val="22"/>
         </w:rPr>
-        <w:t>Implement or perform the guided practical practical for this topic.</w:t>
+        <w:t>Implement or perform the concept development practical for this topic.</w:t>
       </w:r>
     </w:p>
     <w:p>
@@ -793,7 +711,7 @@
           <w:b w:val="0"/>
           <w:sz w:val="22"/>
         </w:rPr>
-        <w:t>Define the professional meaning of “Ai Orientation And Responsible Use” before you use tools. Do not split the title into meaningless words. Connect each concept to today's practical action.</w:t>
+        <w:t>Define the professional meaning of “AI Roles, Workflows, and Human Oversight” before you use tools. Do not split the title into meaningless words. Connect each concept to today's practical action.</w:t>
       </w:r>
     </w:p>
     <w:tbl>
@@ -1545,7 +1463,7 @@
           <w:b w:val="0"/>
           <w:sz w:val="18"/>
         </w:rPr>
-        <w:t>└── Day_02_Ai_Orientation_And_Responsible_Use/</w:t>
+        <w:t>└── Day_02_AI_Roles_Workflows_and_Human_Oversight/</w:t>
       </w:r>
     </w:p>
     <w:p>
@@ -1698,7 +1616,7 @@
           <w:b w:val="0"/>
           <w:sz w:val="18"/>
         </w:rPr>
-        <w:t>mkdir Beyond_AI_Internship\Day_02_Ai_Orientation_And_Responsible_Use\evidence, Beyond_AI_Internship\Day_02_Ai_Orientation_And_Responsible_Use\notebooks, Beyond_AI_Internship\Day_02_Ai_Orientation_And_Responsible_Use\src, Beyond_AI_Internship\Day_02_Ai_Orientation_And_Responsible_Use\data, Beyond_AI_Internship\Day_02_Ai_Orientation_And_Responsible_Use\output, Beyond_AI_Internship\Day_02_Ai_Orientation_And_Responsible_Use\report -Force</w:t>
+        <w:t>mkdir Beyond_AI_Internship\Day_02_AI_Roles_Workflows_and_Human_Oversight\evidence, Beyond_AI_Internship\Day_02_AI_Roles_Workflows_and_Human_Oversight\notebooks, Beyond_AI_Internship\Day_02_AI_Roles_Workflows_and_Human_Oversight\src, Beyond_AI_Internship\Day_02_AI_Roles_Workflows_and_Human_Oversight\data, Beyond_AI_Internship\Day_02_AI_Roles_Workflows_and_Human_Oversight\output, Beyond_AI_Internship\Day_02_AI_Roles_Workflows_and_Human_Oversight\report -Force</w:t>
       </w:r>
     </w:p>
     <w:p/>
@@ -1739,7 +1657,7 @@
           <w:b w:val="0"/>
           <w:sz w:val="18"/>
         </w:rPr>
-        <w:t>mkdir -p Beyond_AI_Internship/Day_02_Ai_Orientation_And_Responsible_Use/{evidence,notebooks,src,data,output,report}</w:t>
+        <w:t>mkdir -p Beyond_AI_Internship/Day_02_AI_Roles_Workflows_and_Human_Oversight/{evidence,notebooks,src,data,output,report}</w:t>
       </w:r>
     </w:p>
     <w:p/>
@@ -1855,7 +1773,7 @@
           <w:color w:val="0B3F90"/>
           <w:sz w:val="24"/>
         </w:rPr>
-        <w:t>Guided practical: Ai Orientation And Responsible Use</w:t>
+        <w:t>Concept development: AI Roles, Workflows, and Human Oversight</w:t>
       </w:r>
     </w:p>
     <w:p>
@@ -1879,7 +1797,7 @@
           <w:b w:val="0"/>
           <w:sz w:val="20"/>
         </w:rPr>
-        <w:t>• Follow the approved step-by-step lab for AI orientation and responsible use. Record every important command, setting or connection.</w:t>
+        <w:t>• Review Day 1 prerequisites and read the complete Day 2 objective before changing the lab.</w:t>
       </w:r>
     </w:p>
     <w:p>
@@ -1891,7 +1809,7 @@
           <w:b w:val="0"/>
           <w:sz w:val="20"/>
         </w:rPr>
-        <w:t>• Work only in an authorized lab, VM or on equipment assigned by Beyond.</w:t>
+        <w:t>• Prepare only the authorized workstation, VM, account, dataset, or sandbox; capture the approved starting state.</w:t>
       </w:r>
     </w:p>
     <w:p>
@@ -1903,7 +1821,67 @@
           <w:b w:val="0"/>
           <w:sz w:val="20"/>
         </w:rPr>
-        <w:t>• Keep time entries truthful and ask the supervisor before changing production equipment.</w:t>
+        <w:t>• Create the folder Day_002_ai_roles_workflows_and_human_oversight with evidence, src or notebooks, output, and report subfolders as relevant.</w:t>
+      </w:r>
+    </w:p>
+    <w:p>
+      <w:pPr>
+        <w:spacing w:after="120"/>
+      </w:pPr>
+      <w:r>
+        <w:rPr>
+          <w:b w:val="0"/>
+          <w:sz w:val="20"/>
+        </w:rPr>
+        <w:t>• Complete the practical objective: Map an AI task from request to accountable human approval.</w:t>
+      </w:r>
+    </w:p>
+    <w:p>
+      <w:pPr>
+        <w:spacing w:after="120"/>
+      </w:pPr>
+      <w:r>
+        <w:rPr>
+          <w:b w:val="0"/>
+          <w:sz w:val="20"/>
+        </w:rPr>
+        <w:t>• Record tool versions, inputs, assumptions, commands or code, expected output, observed output, and any deviations.</w:t>
+      </w:r>
+    </w:p>
+    <w:p>
+      <w:pPr>
+        <w:spacing w:after="120"/>
+      </w:pPr>
+      <w:r>
+        <w:rPr>
+          <w:b w:val="0"/>
+          <w:sz w:val="20"/>
+        </w:rPr>
+        <w:t>• Verify the result independently by rerunning from a clean state, checking a second measurement/test, or obtaining recorded peer review.</w:t>
+      </w:r>
+    </w:p>
+    <w:p>
+      <w:pPr>
+        <w:spacing w:after="120"/>
+      </w:pPr>
+      <w:r>
+        <w:rPr>
+          <w:b w:val="0"/>
+          <w:sz w:val="20"/>
+        </w:rPr>
+        <w:t>• Perform the relevant privacy, bias, security, licensing, and human-oversight checks before accepting the result.</w:t>
+      </w:r>
+    </w:p>
+    <w:p>
+      <w:pPr>
+        <w:spacing w:after="120"/>
+      </w:pPr>
+      <w:r>
+        <w:rPr>
+          <w:b w:val="0"/>
+          <w:sz w:val="20"/>
+        </w:rPr>
+        <w:t>• Package the required evidence and write a concise professional technical report with an AI-assistance disclosure.</w:t>
       </w:r>
     </w:p>
     <w:p>
@@ -1929,7 +1907,7 @@
           <w:b w:val="0"/>
           <w:sz w:val="18"/>
         </w:rPr>
-        <w:t># day_02_lab.py — Guided practical: Ai Orientation And Responsible Use</w:t>
+        <w:t># day_02_lab.py — Concept development: AI Roles, Workflows, and Human Oversight</w:t>
       </w:r>
     </w:p>
     <w:p>
@@ -1971,7 +1949,7 @@
           <w:b w:val="0"/>
           <w:sz w:val="18"/>
         </w:rPr>
-        <w:t>"""Day 2 practical starter for Ai Orientation And Responsible Use.</w:t>
+        <w:t>"""Day 2 practical starter for AI Roles, Workflows, and Human Oversight.</w:t>
       </w:r>
     </w:p>
     <w:p>
@@ -2153,7 +2131,7 @@
           <w:b w:val="0"/>
           <w:sz w:val="18"/>
         </w:rPr>
-        <w:t xml:space="preserve">    print("Program topic:", 'Ai Orientation And Responsible Use')</w:t>
+        <w:t xml:space="preserve">    print("Program topic:", 'AI Roles, Workflows, and Human Oversight')</w:t>
       </w:r>
     </w:p>
     <w:p>
@@ -2167,7 +2145,7 @@
           <w:b w:val="0"/>
           <w:sz w:val="18"/>
         </w:rPr>
-        <w:t xml:space="preserve">    print("Day mode:", 'Guided practical')</w:t>
+        <w:t xml:space="preserve">    print("Day mode:", 'Concept development')</w:t>
       </w:r>
     </w:p>
     <w:p>
@@ -5772,7 +5750,7 @@
           <w:b w:val="0"/>
           <w:sz w:val="22"/>
         </w:rPr>
-        <w:t>Objective addressed for Ai Orientation And Responsible Use</w:t>
+        <w:t>Objective addressed for AI Roles, Workflows, and Human Oversight</w:t>
       </w:r>
     </w:p>
     <w:p>
@@ -5784,7 +5762,7 @@
           <w:b w:val="0"/>
           <w:sz w:val="22"/>
         </w:rPr>
-        <w:t>Guided practical practical completed</w:t>
+        <w:t>Concept development practical completed</w:t>
       </w:r>
     </w:p>
     <w:p>
@@ -5876,7 +5854,7 @@
           <w:b w:val="0"/>
           <w:sz w:val="22"/>
         </w:rPr>
-        <w:t>Matches: Screenshots/photos of the major steps, configuration or worksheet, and a concise result description.</w:t>
+        <w:t>Matches: Setup evidence, completed practical artifact, independent verification record, safety/ethics check, and short technical report.</w:t>
       </w:r>
     </w:p>
     <w:p>
@@ -5908,7 +5886,7 @@
           <w:b w:val="0"/>
           <w:sz w:val="22"/>
         </w:rPr>
-        <w:t>Explain Ai Orientation And Responsible Use without reading.</w:t>
+        <w:t>Explain AI Roles, Workflows, and Human Oversight without reading.</w:t>
       </w:r>
     </w:p>
     <w:p>
@@ -6000,7 +5978,7 @@
           <w:b w:val="0"/>
           <w:sz w:val="22"/>
         </w:rPr>
-        <w:t>Today is Day 2 (Guided practical) on Ai Orientation And Responsible Use. I worked only in the authorized Beyond AI / data / software lab. I completed the practical objective, verified with a second check, and packaged evidence. Main risk: unauthorized or unsafe action; control: checklist + supervisor escalation. Limitation: classroom/lab scope only. Next: continue the topic cycle and keep documentation reproducible.</w:t>
+        <w:t>Today is Day 2 (Concept development) on AI Roles, Workflows, and Human Oversight. I worked only in the authorized Beyond AI / data / software lab. I completed the practical objective, verified with a second check, and packaged evidence. Main risk: unauthorized or unsafe action; control: checklist + supervisor escalation. Limitation: classroom/lab scope only. Next: continue the topic cycle and keep documentation reproducible.</w:t>
       </w:r>
     </w:p>
     <w:p>

</xml_diff>